<commit_message>
Use the renamed Vercel projects (vistora, vistora-api)
The website now calls https://vistora-api.vercel.app. Preview builds of
both the old and the new project names are allowed by CORS.

Co-Authored-By: Claude Opus 5.5 <noreply@anthropic.com>
</commit_message>
<xml_diff>
--- a/docs/Vistora - Project Guide.docx
+++ b/docs/Vistora - Project Guide.docx
@@ -3649,8 +3649,7 @@
     <w:tbl>
       <w:tblPr>
         <w:tblStyle w:val="Table"/>
-        <w:tblW w:type="pct" w:w="5000"/>
-        <w:tblLayout w:type="fixed"/>
+        <w:tblW w:type="auto" w:w="0"/>
         <w:tblLook w:firstRow="1" w:lastRow="0" w:firstColumn="0" w:lastColumn="0" w:noHBand="0" w:noVBand="0" w:val="0020"/>
       </w:tblPr>
       <w:tblGrid>
@@ -3736,7 +3735,7 @@
                 <w:rPr>
                   <w:rStyle w:val="Hyperlink"/>
                 </w:rPr>
-                <w:t xml:space="preserve">snapbuy-ai-api.vercel.app</w:t>
+                <w:t xml:space="preserve">vistora-api.vercel.app</w:t>
               </w:r>
             </w:hyperlink>
           </w:p>

</xml_diff>

<commit_message>
Use vistora-app.vercel.app as the website address
Co-Authored-By: Claude Opus 5.5 <noreply@anthropic.com>
</commit_message>
<xml_diff>
--- a/docs/Vistora - Project Guide.docx
+++ b/docs/Vistora - Project Guide.docx
@@ -86,7 +86,7 @@
           <w:rPr>
             <w:rStyle w:val="Hyperlink"/>
           </w:rPr>
-          <w:t xml:space="preserve">snapbuy-ai.vercel.app</w:t>
+          <w:t xml:space="preserve">vistora-app.vercel.app</w:t>
         </w:r>
       </w:hyperlink>
     </w:p>
@@ -3706,7 +3706,7 @@
                 <w:rPr>
                   <w:rStyle w:val="Hyperlink"/>
                 </w:rPr>
-                <w:t xml:space="preserve">snapbuy-ai.vercel.app</w:t>
+                <w:t xml:space="preserve">vistora-app.vercel.app</w:t>
               </w:r>
             </w:hyperlink>
           </w:p>

</xml_diff>